<commit_message>
Updated requirement gathering document
</commit_message>
<xml_diff>
--- a/requirementgathering.docx
+++ b/requirementgathering.docx
@@ -144,29 +144,7 @@
           <w:sz w:val="24"/>
           <w:szCs w:val="24"/>
         </w:rPr>
-        <w:t>P</w:t>
-      </w:r>
-      <w:r>
-        <w:rPr>
-          <w:rFonts w:ascii="Times New Roman" w:hAnsi="Times New Roman" w:cs="Times New Roman"/>
-          <w:b/>
-          <w:bCs/>
-          <w:color w:val="1E4D8C"/>
-          <w:sz w:val="24"/>
-          <w:szCs w:val="24"/>
-        </w:rPr>
-        <w:t>repared by</w:t>
-      </w:r>
-      <w:r>
-        <w:rPr>
-          <w:rFonts w:ascii="Times New Roman" w:hAnsi="Times New Roman" w:cs="Times New Roman"/>
-          <w:b/>
-          <w:bCs/>
-          <w:color w:val="1E4D8C"/>
-          <w:sz w:val="24"/>
-          <w:szCs w:val="24"/>
-        </w:rPr>
-        <w:t>- Simran Mukadam</w:t>
+        <w:t>Prepared by- Simran Mukadam</w:t>
       </w:r>
     </w:p>
     <w:p>
@@ -1063,27 +1041,25 @@
           <w:sz w:val="24"/>
           <w:szCs w:val="24"/>
         </w:rPr>
-        <w:t xml:space="preserve">Frontend: HTML, CSS, JavaScript (or </w:t>
-      </w:r>
-      <w:proofErr w:type="gramStart"/>
-      <w:r>
-        <w:rPr>
-          <w:rFonts w:ascii="Times New Roman" w:hAnsi="Times New Roman" w:cs="Times New Roman"/>
-          <w:color w:val="555555"/>
-          <w:sz w:val="24"/>
-          <w:szCs w:val="24"/>
-        </w:rPr>
-        <w:t>React</w:t>
-      </w:r>
-      <w:proofErr w:type="gramEnd"/>
-      <w:r>
-        <w:rPr>
-          <w:rFonts w:ascii="Times New Roman" w:hAnsi="Times New Roman" w:cs="Times New Roman"/>
-          <w:color w:val="555555"/>
-          <w:sz w:val="24"/>
-          <w:szCs w:val="24"/>
-        </w:rPr>
-        <w:t>)</w:t>
+        <w:t xml:space="preserve">Frontend: HTML, </w:t>
+      </w:r>
+      <w:r>
+        <w:rPr>
+          <w:rFonts w:ascii="Times New Roman" w:hAnsi="Times New Roman" w:cs="Times New Roman"/>
+          <w:color w:val="555555"/>
+          <w:sz w:val="24"/>
+          <w:szCs w:val="24"/>
+        </w:rPr>
+        <w:t>Tailwind CSS, TypeScript, React</w:t>
+      </w:r>
+      <w:r>
+        <w:rPr>
+          <w:rFonts w:ascii="Times New Roman" w:hAnsi="Times New Roman" w:cs="Times New Roman"/>
+          <w:color w:val="555555"/>
+          <w:sz w:val="24"/>
+          <w:szCs w:val="24"/>
+        </w:rPr>
+        <w:t>.</w:t>
       </w:r>
     </w:p>
     <w:p>
@@ -1107,7 +1083,16 @@
           <w:sz w:val="24"/>
           <w:szCs w:val="24"/>
         </w:rPr>
-        <w:t>Backend: Node.js / Python (Flask)</w:t>
+        <w:t xml:space="preserve">Backend: </w:t>
+      </w:r>
+      <w:r>
+        <w:rPr>
+          <w:rFonts w:ascii="Times New Roman" w:hAnsi="Times New Roman" w:cs="Times New Roman"/>
+          <w:color w:val="555555"/>
+          <w:sz w:val="24"/>
+          <w:szCs w:val="24"/>
+        </w:rPr>
+        <w:t>Java, .NET, Node.js</w:t>
       </w:r>
     </w:p>
     <w:p>
@@ -1131,7 +1116,37 @@
           <w:sz w:val="24"/>
           <w:szCs w:val="24"/>
         </w:rPr>
-        <w:t xml:space="preserve">Database: MySQL </w:t>
+        <w:t>Database: MySQL</w:t>
+      </w:r>
+      <w:r>
+        <w:rPr>
+          <w:rFonts w:ascii="Times New Roman" w:hAnsi="Times New Roman" w:cs="Times New Roman"/>
+          <w:color w:val="555555"/>
+          <w:sz w:val="24"/>
+          <w:szCs w:val="24"/>
+        </w:rPr>
+        <w:t>,</w:t>
+      </w:r>
+      <w:r>
+        <w:t xml:space="preserve"> </w:t>
+      </w:r>
+      <w:r>
+        <w:rPr>
+          <w:rFonts w:ascii="Times New Roman" w:hAnsi="Times New Roman" w:cs="Times New Roman"/>
+          <w:color w:val="555555"/>
+          <w:sz w:val="24"/>
+          <w:szCs w:val="24"/>
+        </w:rPr>
+        <w:t>Firebase</w:t>
+      </w:r>
+      <w:r>
+        <w:rPr>
+          <w:rFonts w:ascii="Times New Roman" w:hAnsi="Times New Roman" w:cs="Times New Roman"/>
+          <w:color w:val="555555"/>
+          <w:sz w:val="24"/>
+          <w:szCs w:val="24"/>
+        </w:rPr>
+        <w:t>.</w:t>
       </w:r>
     </w:p>
     <w:p>
@@ -1155,7 +1170,16 @@
           <w:sz w:val="24"/>
           <w:szCs w:val="24"/>
         </w:rPr>
-        <w:t>Hosting: Cloud server</w:t>
+        <w:t xml:space="preserve">Hosting: </w:t>
+      </w:r>
+      <w:r>
+        <w:rPr>
+          <w:rFonts w:ascii="Times New Roman" w:hAnsi="Times New Roman" w:cs="Times New Roman"/>
+          <w:color w:val="555555"/>
+          <w:sz w:val="24"/>
+          <w:szCs w:val="24"/>
+        </w:rPr>
+        <w:t>Netlify</w:t>
       </w:r>
     </w:p>
     <w:p>
@@ -1909,12 +1933,6 @@
         <w:gridCol w:w="2820"/>
       </w:tblGrid>
       <w:tr>
-        <w:tblPrEx>
-          <w:tblCellMar>
-            <w:top w:w="0" w:type="dxa"/>
-            <w:bottom w:w="0" w:type="dxa"/>
-          </w:tblCellMar>
-        </w:tblPrEx>
         <w:trPr>
           <w:tblHeader/>
         </w:trPr>
@@ -2016,12 +2034,6 @@
         </w:tc>
       </w:tr>
       <w:tr>
-        <w:tblPrEx>
-          <w:tblCellMar>
-            <w:top w:w="0" w:type="dxa"/>
-            <w:bottom w:w="0" w:type="dxa"/>
-          </w:tblCellMar>
-        </w:tblPrEx>
         <w:tc>
           <w:tcPr>
             <w:tcW w:w="4200" w:type="dxa"/>
@@ -2078,25 +2090,7 @@
                 <w:sz w:val="20"/>
                 <w:szCs w:val="20"/>
               </w:rPr>
-              <w:t>2</w:t>
-            </w:r>
-            <w:r>
-              <w:rPr>
-                <w:rFonts w:ascii="Times New Roman" w:hAnsi="Times New Roman" w:cs="Times New Roman"/>
-                <w:color w:val="555555"/>
-                <w:sz w:val="20"/>
-                <w:szCs w:val="20"/>
-              </w:rPr>
-              <w:t xml:space="preserve"> </w:t>
-            </w:r>
-            <w:r>
-              <w:rPr>
-                <w:rFonts w:ascii="Times New Roman" w:hAnsi="Times New Roman" w:cs="Times New Roman"/>
-                <w:color w:val="555555"/>
-                <w:sz w:val="20"/>
-                <w:szCs w:val="20"/>
-              </w:rPr>
-              <w:t>Days</w:t>
+              <w:t>2 Days</w:t>
             </w:r>
           </w:p>
         </w:tc>
@@ -2132,12 +2126,6 @@
         </w:tc>
       </w:tr>
       <w:tr>
-        <w:tblPrEx>
-          <w:tblCellMar>
-            <w:top w:w="0" w:type="dxa"/>
-            <w:bottom w:w="0" w:type="dxa"/>
-          </w:tblCellMar>
-        </w:tblPrEx>
         <w:tc>
           <w:tcPr>
             <w:tcW w:w="4200" w:type="dxa"/>
@@ -2194,25 +2182,7 @@
                 <w:sz w:val="20"/>
                 <w:szCs w:val="20"/>
               </w:rPr>
-              <w:t>3-4</w:t>
-            </w:r>
-            <w:r>
-              <w:rPr>
-                <w:rFonts w:ascii="Times New Roman" w:hAnsi="Times New Roman" w:cs="Times New Roman"/>
-                <w:color w:val="555555"/>
-                <w:sz w:val="20"/>
-                <w:szCs w:val="20"/>
-              </w:rPr>
-              <w:t xml:space="preserve"> </w:t>
-            </w:r>
-            <w:r>
-              <w:rPr>
-                <w:rFonts w:ascii="Times New Roman" w:hAnsi="Times New Roman" w:cs="Times New Roman"/>
-                <w:color w:val="555555"/>
-                <w:sz w:val="20"/>
-                <w:szCs w:val="20"/>
-              </w:rPr>
-              <w:t>Days</w:t>
+              <w:t>3-4 Days</w:t>
             </w:r>
           </w:p>
         </w:tc>
@@ -2248,12 +2218,6 @@
         </w:tc>
       </w:tr>
       <w:tr>
-        <w:tblPrEx>
-          <w:tblCellMar>
-            <w:top w:w="0" w:type="dxa"/>
-            <w:bottom w:w="0" w:type="dxa"/>
-          </w:tblCellMar>
-        </w:tblPrEx>
         <w:tc>
           <w:tcPr>
             <w:tcW w:w="4200" w:type="dxa"/>
@@ -2310,16 +2274,7 @@
                 <w:sz w:val="20"/>
                 <w:szCs w:val="20"/>
               </w:rPr>
-              <w:t xml:space="preserve">1 </w:t>
-            </w:r>
-            <w:r>
-              <w:rPr>
-                <w:rFonts w:ascii="Times New Roman" w:hAnsi="Times New Roman" w:cs="Times New Roman"/>
-                <w:color w:val="555555"/>
-                <w:sz w:val="20"/>
-                <w:szCs w:val="20"/>
-              </w:rPr>
-              <w:t>Week</w:t>
+              <w:t>1 Week</w:t>
             </w:r>
           </w:p>
         </w:tc>
@@ -2355,12 +2310,6 @@
         </w:tc>
       </w:tr>
       <w:tr>
-        <w:tblPrEx>
-          <w:tblCellMar>
-            <w:top w:w="0" w:type="dxa"/>
-            <w:bottom w:w="0" w:type="dxa"/>
-          </w:tblCellMar>
-        </w:tblPrEx>
         <w:tc>
           <w:tcPr>
             <w:tcW w:w="4200" w:type="dxa"/>
@@ -2417,25 +2366,7 @@
                 <w:sz w:val="20"/>
                 <w:szCs w:val="20"/>
               </w:rPr>
-              <w:t>3-4</w:t>
-            </w:r>
-            <w:r>
-              <w:rPr>
-                <w:rFonts w:ascii="Times New Roman" w:hAnsi="Times New Roman" w:cs="Times New Roman"/>
-                <w:color w:val="555555"/>
-                <w:sz w:val="20"/>
-                <w:szCs w:val="20"/>
-              </w:rPr>
-              <w:t xml:space="preserve"> </w:t>
-            </w:r>
-            <w:r>
-              <w:rPr>
-                <w:rFonts w:ascii="Times New Roman" w:hAnsi="Times New Roman" w:cs="Times New Roman"/>
-                <w:color w:val="555555"/>
-                <w:sz w:val="20"/>
-                <w:szCs w:val="20"/>
-              </w:rPr>
-              <w:t>Days</w:t>
+              <w:t>3-4 Days</w:t>
             </w:r>
           </w:p>
         </w:tc>
@@ -2471,12 +2402,6 @@
         </w:tc>
       </w:tr>
       <w:tr>
-        <w:tblPrEx>
-          <w:tblCellMar>
-            <w:top w:w="0" w:type="dxa"/>
-            <w:bottom w:w="0" w:type="dxa"/>
-          </w:tblCellMar>
-        </w:tblPrEx>
         <w:tc>
           <w:tcPr>
             <w:tcW w:w="4200" w:type="dxa"/>
@@ -2533,16 +2458,7 @@
                 <w:sz w:val="20"/>
                 <w:szCs w:val="20"/>
               </w:rPr>
-              <w:t>2</w:t>
-            </w:r>
-            <w:r>
-              <w:rPr>
-                <w:rFonts w:ascii="Times New Roman" w:hAnsi="Times New Roman" w:cs="Times New Roman"/>
-                <w:color w:val="555555"/>
-                <w:sz w:val="20"/>
-                <w:szCs w:val="20"/>
-              </w:rPr>
-              <w:t xml:space="preserve"> Days</w:t>
+              <w:t>2 Days</w:t>
             </w:r>
           </w:p>
         </w:tc>
@@ -2578,12 +2494,6 @@
         </w:tc>
       </w:tr>
       <w:tr>
-        <w:tblPrEx>
-          <w:tblCellMar>
-            <w:top w:w="0" w:type="dxa"/>
-            <w:bottom w:w="0" w:type="dxa"/>
-          </w:tblCellMar>
-        </w:tblPrEx>
         <w:tc>
           <w:tcPr>
             <w:tcW w:w="4200" w:type="dxa"/>
@@ -2737,12 +2647,6 @@
         <w:gridCol w:w="1680"/>
       </w:tblGrid>
       <w:tr>
-        <w:tblPrEx>
-          <w:tblCellMar>
-            <w:top w:w="0" w:type="dxa"/>
-            <w:bottom w:w="0" w:type="dxa"/>
-          </w:tblCellMar>
-        </w:tblPrEx>
         <w:trPr>
           <w:tblHeader/>
         </w:trPr>
@@ -2892,12 +2796,6 @@
         </w:tc>
       </w:tr>
       <w:tr>
-        <w:tblPrEx>
-          <w:tblCellMar>
-            <w:top w:w="0" w:type="dxa"/>
-            <w:bottom w:w="0" w:type="dxa"/>
-          </w:tblCellMar>
-        </w:tblPrEx>
         <w:tc>
           <w:tcPr>
             <w:tcW w:w="3120" w:type="dxa"/>
@@ -3045,12 +2943,6 @@
         </w:tc>
       </w:tr>
       <w:tr>
-        <w:tblPrEx>
-          <w:tblCellMar>
-            <w:top w:w="0" w:type="dxa"/>
-            <w:bottom w:w="0" w:type="dxa"/>
-          </w:tblCellMar>
-        </w:tblPrEx>
         <w:tc>
           <w:tcPr>
             <w:tcW w:w="3120" w:type="dxa"/>

</xml_diff>